<commit_message>
1.1 Project Background and Motivation
1.1 Project Background and Motivation
</commit_message>
<xml_diff>
--- a/Documentation/ASECW Documentation.docx
+++ b/Documentation/ASECW Documentation.docx
@@ -320,8 +320,13 @@
       <w:r>
         <w:t xml:space="preserve">Nirmani </w:t>
       </w:r>
-      <w:r>
-        <w:t xml:space="preserve">Dhanasekara </w:t>
+      <w:proofErr w:type="spellStart"/>
+      <w:r>
+        <w:t>Dhanasekara</w:t>
+      </w:r>
+      <w:proofErr w:type="spellEnd"/>
+      <w:r>
+        <w:t xml:space="preserve"> </w:t>
       </w:r>
       <w:r>
         <w:t xml:space="preserve">/ </w:t>
@@ -395,7 +400,15 @@
         <w:t>Lecturer:</w:t>
       </w:r>
       <w:r>
-        <w:t xml:space="preserve"> Mrs.Yamuna Nawarathne</w:t>
+        <w:t xml:space="preserve"> </w:t>
+      </w:r>
+      <w:proofErr w:type="spellStart"/>
+      <w:r>
+        <w:t>Mrs.Yamuna</w:t>
+      </w:r>
+      <w:proofErr w:type="spellEnd"/>
+      <w:r>
+        <w:t xml:space="preserve"> Nawarathne</w:t>
       </w:r>
     </w:p>
     <w:p>
@@ -485,101 +498,105 @@
           <w:bCs/>
           <w:lang w:val="en-GB"/>
         </w:rPr>
-        <w:t>Module Leader: Dr. Lochandaka Ranathunga</w:t>
-      </w:r>
-    </w:p>
-    <w:p>
-      <w:pPr>
-        <w:pStyle w:val="NoSpacing"/>
+        <w:t xml:space="preserve">Module Leader: </w:t>
+      </w:r>
+      <w:proofErr w:type="spellStart"/>
+      <w:r>
         <w:rPr>
           <w:b/>
           <w:bCs/>
           <w:lang w:val="en-GB"/>
         </w:rPr>
-      </w:pPr>
-    </w:p>
-    <w:p>
-      <w:pPr>
-        <w:pStyle w:val="NoSpacing"/>
+        <w:t>Dr.</w:t>
+      </w:r>
+      <w:proofErr w:type="spellEnd"/>
+      <w:r>
         <w:rPr>
           <w:b/>
           <w:bCs/>
           <w:lang w:val="en-GB"/>
         </w:rPr>
-      </w:pPr>
+        <w:t xml:space="preserve"> </w:t>
+      </w:r>
+      <w:proofErr w:type="spellStart"/>
       <w:r>
         <w:rPr>
           <w:b/>
           <w:bCs/>
           <w:lang w:val="en-GB"/>
         </w:rPr>
-        <w:t>Part 1 weighting: 30% in total</w:t>
-      </w:r>
-    </w:p>
-    <w:p>
-      <w:pPr>
-        <w:pStyle w:val="NoSpacing"/>
-        <w:rPr>
-          <w:lang w:val="en-GB"/>
-        </w:rPr>
-      </w:pPr>
-    </w:p>
-    <w:p>
-      <w:pPr>
-        <w:pStyle w:val="NoSpacing"/>
-        <w:rPr>
-          <w:lang w:val="en-GB"/>
-        </w:rPr>
-      </w:pPr>
-    </w:p>
-    <w:p>
-      <w:pPr>
-        <w:pStyle w:val="NoSpacing"/>
+        <w:t>Lochandaka</w:t>
+      </w:r>
+      <w:proofErr w:type="spellEnd"/>
+      <w:r>
         <w:rPr>
           <w:b/>
           <w:bCs/>
           <w:lang w:val="en-GB"/>
         </w:rPr>
-      </w:pPr>
-      <w:r>
+        <w:t xml:space="preserve"> Ranathunga</w:t>
+      </w:r>
+    </w:p>
+    <w:p>
+      <w:pPr>
+        <w:pStyle w:val="NoSpacing"/>
         <w:rPr>
           <w:b/>
           <w:bCs/>
           <w:lang w:val="en-GB"/>
         </w:rPr>
-        <w:t xml:space="preserve">GROUP STUDENT </w:t>
-      </w:r>
-      <w:r>
+      </w:pPr>
+    </w:p>
+    <w:p>
+      <w:pPr>
+        <w:pStyle w:val="NoSpacing"/>
         <w:rPr>
           <w:b/>
           <w:bCs/>
           <w:lang w:val="en-GB"/>
         </w:rPr>
-        <w:t>NAMES</w:t>
-      </w:r>
+      </w:pPr>
       <w:r>
         <w:rPr>
           <w:b/>
           <w:bCs/>
           <w:lang w:val="en-GB"/>
         </w:rPr>
-        <w:t xml:space="preserve"> </w:t>
-      </w:r>
-      <w:r>
+        <w:t>Part 1 weighting: 30% in total</w:t>
+      </w:r>
+    </w:p>
+    <w:p>
+      <w:pPr>
+        <w:pStyle w:val="NoSpacing"/>
+        <w:rPr>
+          <w:lang w:val="en-GB"/>
+        </w:rPr>
+      </w:pPr>
+    </w:p>
+    <w:p>
+      <w:pPr>
+        <w:pStyle w:val="NoSpacing"/>
+        <w:rPr>
+          <w:lang w:val="en-GB"/>
+        </w:rPr>
+      </w:pPr>
+    </w:p>
+    <w:p>
+      <w:pPr>
+        <w:pStyle w:val="NoSpacing"/>
         <w:rPr>
           <w:b/>
           <w:bCs/>
           <w:lang w:val="en-GB"/>
         </w:rPr>
-        <w:t>&amp;</w:t>
-      </w:r>
+      </w:pPr>
       <w:r>
         <w:rPr>
           <w:b/>
           <w:bCs/>
           <w:lang w:val="en-GB"/>
         </w:rPr>
-        <w:t xml:space="preserve"> </w:t>
+        <w:t xml:space="preserve">GROUP STUDENT </w:t>
       </w:r>
       <w:r>
         <w:rPr>
@@ -587,7 +604,7 @@
           <w:bCs/>
           <w:lang w:val="en-GB"/>
         </w:rPr>
-        <w:t>ID NUMBERS</w:t>
+        <w:t>NAMES</w:t>
       </w:r>
       <w:r>
         <w:rPr>
@@ -595,17 +612,49 @@
           <w:bCs/>
           <w:lang w:val="en-GB"/>
         </w:rPr>
-        <w:t>:</w:t>
-      </w:r>
-    </w:p>
-    <w:p>
-      <w:pPr>
-        <w:pStyle w:val="NoSpacing"/>
+        <w:t xml:space="preserve"> </w:t>
+      </w:r>
+      <w:r>
         <w:rPr>
           <w:b/>
           <w:bCs/>
           <w:lang w:val="en-GB"/>
         </w:rPr>
+        <w:t>&amp;</w:t>
+      </w:r>
+      <w:r>
+        <w:rPr>
+          <w:b/>
+          <w:bCs/>
+          <w:lang w:val="en-GB"/>
+        </w:rPr>
+        <w:t xml:space="preserve"> </w:t>
+      </w:r>
+      <w:r>
+        <w:rPr>
+          <w:b/>
+          <w:bCs/>
+          <w:lang w:val="en-GB"/>
+        </w:rPr>
+        <w:t>ID NUMBERS</w:t>
+      </w:r>
+      <w:r>
+        <w:rPr>
+          <w:b/>
+          <w:bCs/>
+          <w:lang w:val="en-GB"/>
+        </w:rPr>
+        <w:t>:</w:t>
+      </w:r>
+    </w:p>
+    <w:p>
+      <w:pPr>
+        <w:pStyle w:val="NoSpacing"/>
+        <w:rPr>
+          <w:b/>
+          <w:bCs/>
+          <w:lang w:val="en-GB"/>
+        </w:rPr>
       </w:pPr>
     </w:p>
     <w:p>
@@ -650,7 +699,15 @@
         <w:spacing w:line="360" w:lineRule="auto"/>
       </w:pPr>
       <w:r>
-        <w:t xml:space="preserve">Nirmani Dhanasekara / </w:t>
+        <w:t xml:space="preserve">Nirmani </w:t>
+      </w:r>
+      <w:proofErr w:type="spellStart"/>
+      <w:r>
+        <w:t>Dhanasekara</w:t>
+      </w:r>
+      <w:proofErr w:type="spellEnd"/>
+      <w:r>
+        <w:t xml:space="preserve"> / </w:t>
       </w:r>
       <w:r>
         <w:t>E182349</w:t>
@@ -997,7 +1054,23 @@
           <w:i/>
           <w:iCs/>
         </w:rPr>
-        <w:t xml:space="preserve">(i) </w:t>
+        <w:t>(</w:t>
+      </w:r>
+      <w:proofErr w:type="spellStart"/>
+      <w:r>
+        <w:rPr>
+          <w:i/>
+          <w:iCs/>
+        </w:rPr>
+        <w:t>i</w:t>
+      </w:r>
+      <w:proofErr w:type="spellEnd"/>
+      <w:r>
+        <w:rPr>
+          <w:i/>
+          <w:iCs/>
+        </w:rPr>
+        <w:t xml:space="preserve">) </w:t>
       </w:r>
       <w:r>
         <w:rPr>
@@ -6399,23 +6472,24 @@
           <w:szCs w:val="32"/>
         </w:rPr>
       </w:pPr>
+      <w:proofErr w:type="spellStart"/>
       <w:r>
         <w:rPr>
           <w:rFonts w:eastAsiaTheme="majorEastAsia" w:cstheme="majorBidi"/>
           <w:b/>
           <w:szCs w:val="32"/>
         </w:rPr>
-        <w:t>hhh</w:t>
-      </w:r>
-    </w:p>
-    <w:p>
-      <w:pPr>
+        <w:t>H</w:t>
+      </w:r>
+      <w:r>
         <w:rPr>
           <w:rFonts w:eastAsiaTheme="majorEastAsia" w:cstheme="majorBidi"/>
           <w:b/>
           <w:szCs w:val="32"/>
         </w:rPr>
-      </w:pPr>
+        <w:t>hh</w:t>
+      </w:r>
+      <w:proofErr w:type="spellEnd"/>
     </w:p>
     <w:p>
       <w:pPr>
@@ -6428,6 +6502,256 @@
     </w:p>
     <w:p>
       <w:pPr>
+        <w:rPr>
+          <w:rFonts w:eastAsiaTheme="majorEastAsia" w:cstheme="majorBidi"/>
+          <w:b/>
+          <w:szCs w:val="32"/>
+        </w:rPr>
+      </w:pPr>
+      <w:r>
+        <w:rPr>
+          <w:rFonts w:eastAsiaTheme="majorEastAsia" w:cstheme="majorBidi"/>
+          <w:b/>
+          <w:szCs w:val="32"/>
+        </w:rPr>
+        <w:t xml:space="preserve">Kalani </w:t>
+      </w:r>
+      <w:proofErr w:type="spellStart"/>
+      <w:r>
+        <w:rPr>
+          <w:rFonts w:eastAsiaTheme="majorEastAsia" w:cstheme="majorBidi"/>
+          <w:b/>
+          <w:szCs w:val="32"/>
+        </w:rPr>
+        <w:t>kalani</w:t>
+      </w:r>
+      <w:proofErr w:type="spellEnd"/>
+      <w:r>
+        <w:rPr>
+          <w:rFonts w:eastAsiaTheme="majorEastAsia" w:cstheme="majorBidi"/>
+          <w:b/>
+          <w:szCs w:val="32"/>
+        </w:rPr>
+        <w:t xml:space="preserve"> </w:t>
+      </w:r>
+      <w:r>
+        <w:rPr>
+          <w:rFonts w:eastAsiaTheme="majorEastAsia" w:cstheme="majorBidi"/>
+          <w:b/>
+          <w:szCs w:val="32"/>
+        </w:rPr>
+        <w:t xml:space="preserve">Kalani </w:t>
+      </w:r>
+      <w:proofErr w:type="spellStart"/>
+      <w:r>
+        <w:rPr>
+          <w:rFonts w:eastAsiaTheme="majorEastAsia" w:cstheme="majorBidi"/>
+          <w:b/>
+          <w:szCs w:val="32"/>
+        </w:rPr>
+        <w:t>kalani</w:t>
+      </w:r>
+      <w:proofErr w:type="spellEnd"/>
+    </w:p>
+    <w:p>
+      <w:pPr>
+        <w:rPr>
+          <w:rFonts w:eastAsiaTheme="majorEastAsia" w:cstheme="majorBidi"/>
+          <w:b/>
+          <w:szCs w:val="32"/>
+        </w:rPr>
+      </w:pPr>
+      <w:r>
+        <w:rPr>
+          <w:rFonts w:eastAsiaTheme="majorEastAsia" w:cstheme="majorBidi"/>
+          <w:b/>
+          <w:szCs w:val="32"/>
+        </w:rPr>
+        <w:t xml:space="preserve"> </w:t>
+      </w:r>
+      <w:r>
+        <w:rPr>
+          <w:rFonts w:eastAsiaTheme="majorEastAsia" w:cstheme="majorBidi"/>
+          <w:b/>
+          <w:szCs w:val="32"/>
+        </w:rPr>
+        <w:t xml:space="preserve">Kalani </w:t>
+      </w:r>
+      <w:proofErr w:type="spellStart"/>
+      <w:r>
+        <w:rPr>
+          <w:rFonts w:eastAsiaTheme="majorEastAsia" w:cstheme="majorBidi"/>
+          <w:b/>
+          <w:szCs w:val="32"/>
+        </w:rPr>
+        <w:t>kalani</w:t>
+      </w:r>
+      <w:proofErr w:type="spellEnd"/>
+    </w:p>
+    <w:p>
+      <w:pPr>
+        <w:rPr>
+          <w:rFonts w:eastAsiaTheme="majorEastAsia" w:cstheme="majorBidi"/>
+          <w:b/>
+          <w:szCs w:val="32"/>
+        </w:rPr>
+      </w:pPr>
+      <w:r>
+        <w:rPr>
+          <w:rFonts w:eastAsiaTheme="majorEastAsia" w:cstheme="majorBidi"/>
+          <w:b/>
+          <w:szCs w:val="32"/>
+        </w:rPr>
+        <w:t xml:space="preserve">Kalani </w:t>
+      </w:r>
+      <w:proofErr w:type="spellStart"/>
+      <w:r>
+        <w:rPr>
+          <w:rFonts w:eastAsiaTheme="majorEastAsia" w:cstheme="majorBidi"/>
+          <w:b/>
+          <w:szCs w:val="32"/>
+        </w:rPr>
+        <w:t>kalani</w:t>
+      </w:r>
+      <w:proofErr w:type="spellEnd"/>
+    </w:p>
+    <w:p>
+      <w:pPr>
+        <w:rPr>
+          <w:rFonts w:eastAsiaTheme="majorEastAsia" w:cstheme="majorBidi"/>
+          <w:b/>
+          <w:szCs w:val="32"/>
+        </w:rPr>
+      </w:pPr>
+      <w:r>
+        <w:rPr>
+          <w:rFonts w:eastAsiaTheme="majorEastAsia" w:cstheme="majorBidi"/>
+          <w:b/>
+          <w:szCs w:val="32"/>
+        </w:rPr>
+        <w:t xml:space="preserve">Kalani </w:t>
+      </w:r>
+      <w:proofErr w:type="spellStart"/>
+      <w:r>
+        <w:rPr>
+          <w:rFonts w:eastAsiaTheme="majorEastAsia" w:cstheme="majorBidi"/>
+          <w:b/>
+          <w:szCs w:val="32"/>
+        </w:rPr>
+        <w:t>kalani</w:t>
+      </w:r>
+      <w:proofErr w:type="spellEnd"/>
+    </w:p>
+    <w:p>
+      <w:pPr>
+        <w:rPr>
+          <w:rFonts w:eastAsiaTheme="majorEastAsia" w:cstheme="majorBidi"/>
+          <w:b/>
+          <w:szCs w:val="32"/>
+        </w:rPr>
+      </w:pPr>
+      <w:r>
+        <w:rPr>
+          <w:rFonts w:eastAsiaTheme="majorEastAsia" w:cstheme="majorBidi"/>
+          <w:b/>
+          <w:szCs w:val="32"/>
+        </w:rPr>
+        <w:t xml:space="preserve">Kalani </w:t>
+      </w:r>
+      <w:proofErr w:type="spellStart"/>
+      <w:r>
+        <w:rPr>
+          <w:rFonts w:eastAsiaTheme="majorEastAsia" w:cstheme="majorBidi"/>
+          <w:b/>
+          <w:szCs w:val="32"/>
+        </w:rPr>
+        <w:t>kalani</w:t>
+      </w:r>
+      <w:proofErr w:type="spellEnd"/>
+    </w:p>
+    <w:p>
+      <w:pPr>
+        <w:rPr>
+          <w:rFonts w:eastAsiaTheme="majorEastAsia" w:cstheme="majorBidi"/>
+          <w:b/>
+          <w:szCs w:val="32"/>
+        </w:rPr>
+      </w:pPr>
+      <w:r>
+        <w:rPr>
+          <w:rFonts w:eastAsiaTheme="majorEastAsia" w:cstheme="majorBidi"/>
+          <w:b/>
+          <w:szCs w:val="32"/>
+        </w:rPr>
+        <w:t xml:space="preserve">Kalani </w:t>
+      </w:r>
+      <w:proofErr w:type="spellStart"/>
+      <w:r>
+        <w:rPr>
+          <w:rFonts w:eastAsiaTheme="majorEastAsia" w:cstheme="majorBidi"/>
+          <w:b/>
+          <w:szCs w:val="32"/>
+        </w:rPr>
+        <w:t>kalani</w:t>
+      </w:r>
+      <w:proofErr w:type="spellEnd"/>
+    </w:p>
+    <w:p>
+      <w:pPr>
+        <w:rPr>
+          <w:rFonts w:eastAsiaTheme="majorEastAsia" w:cstheme="majorBidi"/>
+          <w:b/>
+          <w:szCs w:val="32"/>
+        </w:rPr>
+      </w:pPr>
+      <w:r>
+        <w:rPr>
+          <w:rFonts w:eastAsiaTheme="majorEastAsia" w:cstheme="majorBidi"/>
+          <w:b/>
+          <w:szCs w:val="32"/>
+        </w:rPr>
+        <w:t xml:space="preserve">Kalani </w:t>
+      </w:r>
+      <w:proofErr w:type="spellStart"/>
+      <w:r>
+        <w:rPr>
+          <w:rFonts w:eastAsiaTheme="majorEastAsia" w:cstheme="majorBidi"/>
+          <w:b/>
+          <w:szCs w:val="32"/>
+        </w:rPr>
+        <w:t>kalani</w:t>
+      </w:r>
+      <w:proofErr w:type="spellEnd"/>
+    </w:p>
+    <w:p>
+      <w:pPr>
+        <w:rPr>
+          <w:rFonts w:eastAsiaTheme="majorEastAsia" w:cstheme="majorBidi"/>
+          <w:b/>
+          <w:szCs w:val="32"/>
+        </w:rPr>
+      </w:pPr>
+    </w:p>
+    <w:p>
+      <w:pPr>
+        <w:rPr>
+          <w:rFonts w:eastAsiaTheme="majorEastAsia" w:cstheme="majorBidi"/>
+          <w:b/>
+          <w:szCs w:val="32"/>
+        </w:rPr>
+      </w:pPr>
+    </w:p>
+    <w:p>
+      <w:pPr>
+        <w:rPr>
+          <w:rFonts w:eastAsiaTheme="majorEastAsia" w:cstheme="majorBidi"/>
+          <w:b/>
+          <w:szCs w:val="32"/>
+        </w:rPr>
+      </w:pPr>
+    </w:p>
+    <w:p>
+      <w:pPr>
         <w:pStyle w:val="Heading2"/>
       </w:pPr>
       <w:bookmarkStart w:id="6" w:name="_Toc176793403"/>
@@ -6475,6 +6799,7 @@
       </w:pPr>
       <w:bookmarkStart w:id="9" w:name="_Toc176793406"/>
       <w:r>
+        <w:lastRenderedPageBreak/>
         <w:t>1.3 Future Enhancement</w:t>
       </w:r>
       <w:bookmarkEnd w:id="9"/>
@@ -6501,7 +6826,6 @@
       </w:pPr>
       <w:bookmarkStart w:id="10" w:name="_Toc176793407"/>
       <w:r>
-        <w:lastRenderedPageBreak/>
         <w:t>Chapter 2</w:t>
       </w:r>
       <w:bookmarkEnd w:id="10"/>
@@ -6623,6 +6947,7 @@
       </w:pPr>
       <w:bookmarkStart w:id="17" w:name="_Toc176793414"/>
       <w:r>
+        <w:lastRenderedPageBreak/>
         <w:t>2.4.2 Justification for requirement gathering</w:t>
       </w:r>
       <w:bookmarkEnd w:id="17"/>
@@ -6647,24 +6972,322 @@
       </w:pPr>
       <w:bookmarkStart w:id="18" w:name="_Toc176793415"/>
       <w:r>
+        <w:t>Chapter 3</w:t>
+      </w:r>
+      <w:bookmarkEnd w:id="18"/>
+    </w:p>
+    <w:p>
+      <w:pPr>
+        <w:pStyle w:val="Heading2"/>
+      </w:pPr>
+      <w:bookmarkStart w:id="19" w:name="_Toc176793416"/>
+      <w:r>
+        <w:t>3.1 Functional and non-functional requirements</w:t>
+      </w:r>
+      <w:bookmarkEnd w:id="19"/>
+    </w:p>
+    <w:p/>
+    <w:p/>
+    <w:p/>
+    <w:p>
+      <w:pPr>
+        <w:rPr>
+          <w:rFonts w:eastAsiaTheme="majorEastAsia" w:cstheme="majorBidi"/>
+          <w:b/>
+          <w:szCs w:val="32"/>
+        </w:rPr>
+      </w:pPr>
+    </w:p>
+    <w:p>
+      <w:pPr>
+        <w:pStyle w:val="Heading3"/>
+      </w:pPr>
+      <w:bookmarkStart w:id="20" w:name="_Toc176793417"/>
+      <w:r>
+        <w:t>3.1.1 Functional Requirements</w:t>
+      </w:r>
+      <w:bookmarkEnd w:id="20"/>
+    </w:p>
+    <w:p/>
+    <w:p/>
+    <w:p/>
+    <w:p/>
+    <w:p>
+      <w:pPr>
+        <w:rPr>
+          <w:rFonts w:eastAsiaTheme="majorEastAsia" w:cstheme="majorBidi"/>
+          <w:b/>
+          <w:szCs w:val="32"/>
+        </w:rPr>
+      </w:pPr>
+    </w:p>
+    <w:p>
+      <w:pPr>
+        <w:pStyle w:val="Heading3"/>
+      </w:pPr>
+      <w:bookmarkStart w:id="21" w:name="_Toc176793418"/>
+      <w:r>
+        <w:t>3.1.2 Non-Functional Requirements</w:t>
+      </w:r>
+      <w:bookmarkEnd w:id="21"/>
+    </w:p>
+    <w:p/>
+    <w:p/>
+    <w:p/>
+    <w:p/>
+    <w:p/>
+    <w:p/>
+    <w:p/>
+    <w:p/>
+    <w:p/>
+    <w:p/>
+    <w:p/>
+    <w:p>
+      <w:pPr>
+        <w:rPr>
+          <w:rFonts w:eastAsiaTheme="majorEastAsia" w:cstheme="majorBidi"/>
+          <w:b/>
+          <w:szCs w:val="28"/>
+        </w:rPr>
+      </w:pPr>
+    </w:p>
+    <w:p/>
+    <w:p/>
+    <w:p>
+      <w:pPr>
+        <w:pStyle w:val="Heading1"/>
+      </w:pPr>
+      <w:bookmarkStart w:id="22" w:name="_Toc176793419"/>
+      <w:r>
+        <w:t>Chapter 4</w:t>
+      </w:r>
+      <w:bookmarkEnd w:id="22"/>
+    </w:p>
+    <w:p>
+      <w:pPr>
+        <w:pStyle w:val="Heading2"/>
+      </w:pPr>
+      <w:bookmarkStart w:id="23" w:name="_Toc176793420"/>
+      <w:r>
+        <w:t>4.1 Architecture Designing</w:t>
+      </w:r>
+      <w:bookmarkEnd w:id="23"/>
+      <w:r>
+        <w:t xml:space="preserve"> </w:t>
+      </w:r>
+    </w:p>
+    <w:p/>
+    <w:p/>
+    <w:p>
+      <w:pPr>
+        <w:pStyle w:val="Heading2"/>
+      </w:pPr>
+      <w:bookmarkStart w:id="24" w:name="_Toc176793421"/>
+      <w:r>
+        <w:t>4.2 User Interface Designing</w:t>
+      </w:r>
+      <w:bookmarkEnd w:id="24"/>
+      <w:r>
+        <w:t xml:space="preserve"> </w:t>
+      </w:r>
+    </w:p>
+    <w:p/>
+    <w:p/>
+    <w:p>
+      <w:pPr>
+        <w:pStyle w:val="Heading2"/>
+      </w:pPr>
+      <w:bookmarkStart w:id="25" w:name="_Toc176793422"/>
+      <w:r>
+        <w:t>4.2.1 Data Input Designing</w:t>
+      </w:r>
+      <w:bookmarkEnd w:id="25"/>
+      <w:r>
+        <w:t xml:space="preserve"> </w:t>
+      </w:r>
+    </w:p>
+    <w:p/>
+    <w:p/>
+    <w:p>
+      <w:pPr>
+        <w:pStyle w:val="Heading2"/>
+      </w:pPr>
+      <w:bookmarkStart w:id="26" w:name="_Toc176793423"/>
+      <w:r>
+        <w:t>4.3 Output Designing</w:t>
+      </w:r>
+      <w:bookmarkEnd w:id="26"/>
+    </w:p>
+    <w:p/>
+    <w:p/>
+    <w:p>
+      <w:pPr>
+        <w:pStyle w:val="Heading2"/>
+      </w:pPr>
+      <w:bookmarkStart w:id="27" w:name="_Toc176793424"/>
+      <w:r>
+        <w:t>4.4 Identify the objects and data and file structures</w:t>
+      </w:r>
+      <w:bookmarkEnd w:id="27"/>
+    </w:p>
+    <w:p/>
+    <w:p/>
+    <w:p>
+      <w:pPr>
+        <w:pStyle w:val="Heading2"/>
+      </w:pPr>
+      <w:bookmarkStart w:id="28" w:name="_Toc176793425"/>
+      <w:r>
+        <w:t>4.5 UML Diagrams</w:t>
+      </w:r>
+      <w:bookmarkEnd w:id="28"/>
+    </w:p>
+    <w:p>
+      <w:pPr>
+        <w:pStyle w:val="Heading3"/>
+      </w:pPr>
+      <w:bookmarkStart w:id="29" w:name="_Toc176793426"/>
+      <w:r>
+        <w:t>4.5.1 Use Case Diagram</w:t>
+      </w:r>
+      <w:bookmarkEnd w:id="29"/>
+    </w:p>
+    <w:p/>
+    <w:p>
+      <w:pPr>
+        <w:pStyle w:val="Heading3"/>
+      </w:pPr>
+      <w:bookmarkStart w:id="30" w:name="_Toc176793427"/>
+      <w:r>
+        <w:t>4.5.2 Activity Diagram</w:t>
+      </w:r>
+      <w:bookmarkEnd w:id="30"/>
+      <w:r>
+        <w:t xml:space="preserve"> </w:t>
+      </w:r>
+    </w:p>
+    <w:p/>
+    <w:p>
+      <w:pPr>
+        <w:pStyle w:val="Heading3"/>
+      </w:pPr>
+      <w:bookmarkStart w:id="31" w:name="_Toc176793428"/>
+      <w:r>
         <w:lastRenderedPageBreak/>
-        <w:t>Chapter 3</w:t>
-      </w:r>
-      <w:bookmarkEnd w:id="18"/>
+        <w:t>4.5.3 Class Diagram</w:t>
+      </w:r>
+      <w:bookmarkEnd w:id="31"/>
+    </w:p>
+    <w:p/>
+    <w:p>
+      <w:pPr>
+        <w:pStyle w:val="Heading3"/>
+      </w:pPr>
+      <w:bookmarkStart w:id="32" w:name="_Toc176793429"/>
+      <w:r>
+        <w:t>4.5.4 Entity Relationship Diagram</w:t>
+      </w:r>
+      <w:bookmarkEnd w:id="32"/>
+    </w:p>
+    <w:p/>
+    <w:p/>
+    <w:p/>
+    <w:p/>
+    <w:p>
+      <w:pPr>
+        <w:pStyle w:val="Heading1"/>
+      </w:pPr>
+      <w:bookmarkStart w:id="33" w:name="_Toc176793430"/>
+      <w:r>
+        <w:t>Chapter 5</w:t>
+      </w:r>
+      <w:bookmarkEnd w:id="33"/>
     </w:p>
     <w:p>
       <w:pPr>
         <w:pStyle w:val="Heading2"/>
       </w:pPr>
-      <w:bookmarkStart w:id="19" w:name="_Toc176793416"/>
-      <w:r>
-        <w:t>3.1 Functional and non-functional requirements</w:t>
-      </w:r>
-      <w:bookmarkEnd w:id="19"/>
-    </w:p>
-    <w:p/>
-    <w:p/>
-    <w:p/>
+      <w:bookmarkStart w:id="34" w:name="_Toc176793431"/>
+      <w:r>
+        <w:t>5.1 Software Tools and Technologies</w:t>
+      </w:r>
+      <w:bookmarkEnd w:id="34"/>
+    </w:p>
+    <w:p>
+      <w:pPr>
+        <w:pStyle w:val="Heading3"/>
+      </w:pPr>
+      <w:bookmarkStart w:id="35" w:name="_Toc176793432"/>
+      <w:r>
+        <w:t>5.1.1 Justification about System Tools and Technology</w:t>
+      </w:r>
+      <w:bookmarkEnd w:id="35"/>
+    </w:p>
+    <w:p/>
+    <w:p/>
+    <w:p>
+      <w:pPr>
+        <w:pStyle w:val="Heading2"/>
+      </w:pPr>
+      <w:bookmarkStart w:id="36" w:name="_Toc176793433"/>
+      <w:r>
+        <w:t>5.2 Implementation Environment</w:t>
+      </w:r>
+      <w:bookmarkEnd w:id="36"/>
+      <w:r>
+        <w:t xml:space="preserve"> </w:t>
+      </w:r>
+    </w:p>
+    <w:p/>
+    <w:p>
+      <w:pPr>
+        <w:pStyle w:val="Heading2"/>
+      </w:pPr>
+      <w:bookmarkStart w:id="37" w:name="_Toc176793434"/>
+      <w:r>
+        <w:t>5.2.1 Hardware Environment</w:t>
+      </w:r>
+      <w:bookmarkEnd w:id="37"/>
+    </w:p>
+    <w:p/>
+    <w:p>
+      <w:pPr>
+        <w:pStyle w:val="Heading2"/>
+      </w:pPr>
+      <w:bookmarkStart w:id="38" w:name="_Toc176793435"/>
+      <w:r>
+        <w:t>5.2.2 Software Environment</w:t>
+      </w:r>
+      <w:bookmarkEnd w:id="38"/>
+      <w:r>
+        <w:t xml:space="preserve"> </w:t>
+      </w:r>
+    </w:p>
+    <w:p/>
+    <w:p>
+      <w:pPr>
+        <w:pStyle w:val="Heading2"/>
+      </w:pPr>
+      <w:bookmarkStart w:id="39" w:name="_Toc176793436"/>
+      <w:r>
+        <w:t>5.3 Module Structure</w:t>
+      </w:r>
+      <w:bookmarkEnd w:id="39"/>
+      <w:r>
+        <w:t xml:space="preserve"> </w:t>
+      </w:r>
+    </w:p>
+    <w:p/>
+    <w:p>
+      <w:pPr>
+        <w:pStyle w:val="Heading2"/>
+      </w:pPr>
+      <w:bookmarkStart w:id="40" w:name="_Toc176793437"/>
+      <w:r>
+        <w:t>5.4 Important Codes</w:t>
+      </w:r>
+      <w:bookmarkEnd w:id="40"/>
+    </w:p>
     <w:p>
       <w:pPr>
         <w:rPr>
@@ -6674,345 +7297,46 @@
         </w:rPr>
       </w:pPr>
     </w:p>
-    <w:p>
-      <w:pPr>
-        <w:pStyle w:val="Heading3"/>
-      </w:pPr>
-      <w:bookmarkStart w:id="20" w:name="_Toc176793417"/>
-      <w:r>
-        <w:t>3.1.1 Functional Requirements</w:t>
-      </w:r>
-      <w:bookmarkEnd w:id="20"/>
-    </w:p>
-    <w:p/>
-    <w:p/>
-    <w:p/>
-    <w:p/>
-    <w:p>
-      <w:pPr>
-        <w:rPr>
-          <w:rFonts w:eastAsiaTheme="majorEastAsia" w:cstheme="majorBidi"/>
-          <w:b/>
-          <w:szCs w:val="32"/>
-        </w:rPr>
-      </w:pPr>
-    </w:p>
-    <w:p>
-      <w:pPr>
-        <w:pStyle w:val="Heading3"/>
-      </w:pPr>
-      <w:bookmarkStart w:id="21" w:name="_Toc176793418"/>
-      <w:r>
-        <w:t>3.1.2 Non-Functional Requirements</w:t>
-      </w:r>
-      <w:bookmarkEnd w:id="21"/>
-    </w:p>
-    <w:p/>
-    <w:p/>
-    <w:p/>
-    <w:p/>
-    <w:p/>
-    <w:p/>
-    <w:p/>
-    <w:p/>
-    <w:p/>
-    <w:p/>
-    <w:p/>
-    <w:p>
-      <w:pPr>
-        <w:rPr>
-          <w:rFonts w:eastAsiaTheme="majorEastAsia" w:cstheme="majorBidi"/>
-          <w:b/>
-          <w:szCs w:val="28"/>
-        </w:rPr>
-      </w:pPr>
-    </w:p>
-    <w:p/>
     <w:p/>
     <w:p>
       <w:pPr>
         <w:pStyle w:val="Heading1"/>
       </w:pPr>
-      <w:bookmarkStart w:id="22" w:name="_Toc176793419"/>
+      <w:bookmarkStart w:id="41" w:name="_Toc176793438"/>
+      <w:r>
+        <w:t>Chapter 6</w:t>
+      </w:r>
+      <w:bookmarkEnd w:id="41"/>
+    </w:p>
+    <w:p>
+      <w:pPr>
+        <w:pStyle w:val="Heading2"/>
+      </w:pPr>
+      <w:bookmarkStart w:id="42" w:name="_Toc176793439"/>
+      <w:r>
+        <w:t>6.1 System Test Plan</w:t>
+      </w:r>
+      <w:bookmarkEnd w:id="42"/>
+    </w:p>
+    <w:p/>
+    <w:p>
+      <w:pPr>
+        <w:pStyle w:val="Heading2"/>
+      </w:pPr>
+      <w:bookmarkStart w:id="43" w:name="_Toc176793440"/>
+      <w:r>
+        <w:t>6.1.1 Test Plan for Wings Hotel</w:t>
+      </w:r>
+      <w:bookmarkEnd w:id="43"/>
+    </w:p>
+    <w:p/>
+    <w:p>
+      <w:pPr>
+        <w:pStyle w:val="Heading2"/>
+      </w:pPr>
+      <w:bookmarkStart w:id="44" w:name="_Toc176793441"/>
       <w:r>
         <w:lastRenderedPageBreak/>
-        <w:t>Chapter 4</w:t>
-      </w:r>
-      <w:bookmarkEnd w:id="22"/>
-    </w:p>
-    <w:p>
-      <w:pPr>
-        <w:pStyle w:val="Heading2"/>
-      </w:pPr>
-      <w:bookmarkStart w:id="23" w:name="_Toc176793420"/>
-      <w:r>
-        <w:t>4.1 Architecture Designing</w:t>
-      </w:r>
-      <w:bookmarkEnd w:id="23"/>
-      <w:r>
-        <w:t xml:space="preserve"> </w:t>
-      </w:r>
-    </w:p>
-    <w:p/>
-    <w:p/>
-    <w:p>
-      <w:pPr>
-        <w:pStyle w:val="Heading2"/>
-      </w:pPr>
-      <w:bookmarkStart w:id="24" w:name="_Toc176793421"/>
-      <w:r>
-        <w:t>4.2 User Interface Designing</w:t>
-      </w:r>
-      <w:bookmarkEnd w:id="24"/>
-      <w:r>
-        <w:t xml:space="preserve"> </w:t>
-      </w:r>
-    </w:p>
-    <w:p/>
-    <w:p/>
-    <w:p>
-      <w:pPr>
-        <w:pStyle w:val="Heading2"/>
-      </w:pPr>
-      <w:bookmarkStart w:id="25" w:name="_Toc176793422"/>
-      <w:r>
-        <w:t>4.2.1 Data Input Designing</w:t>
-      </w:r>
-      <w:bookmarkEnd w:id="25"/>
-      <w:r>
-        <w:t xml:space="preserve"> </w:t>
-      </w:r>
-    </w:p>
-    <w:p/>
-    <w:p/>
-    <w:p>
-      <w:pPr>
-        <w:pStyle w:val="Heading2"/>
-      </w:pPr>
-      <w:bookmarkStart w:id="26" w:name="_Toc176793423"/>
-      <w:r>
-        <w:t>4.3 Output Designing</w:t>
-      </w:r>
-      <w:bookmarkEnd w:id="26"/>
-    </w:p>
-    <w:p/>
-    <w:p/>
-    <w:p>
-      <w:pPr>
-        <w:pStyle w:val="Heading2"/>
-      </w:pPr>
-      <w:bookmarkStart w:id="27" w:name="_Toc176793424"/>
-      <w:r>
-        <w:t>4.4 Identify the objects and data and file structures</w:t>
-      </w:r>
-      <w:bookmarkEnd w:id="27"/>
-    </w:p>
-    <w:p/>
-    <w:p/>
-    <w:p>
-      <w:pPr>
-        <w:pStyle w:val="Heading2"/>
-      </w:pPr>
-      <w:bookmarkStart w:id="28" w:name="_Toc176793425"/>
-      <w:r>
-        <w:t>4.5 UML Diagrams</w:t>
-      </w:r>
-      <w:bookmarkEnd w:id="28"/>
-    </w:p>
-    <w:p>
-      <w:pPr>
-        <w:pStyle w:val="Heading3"/>
-      </w:pPr>
-      <w:bookmarkStart w:id="29" w:name="_Toc176793426"/>
-      <w:r>
-        <w:t>4.5.1 Use Case Diagram</w:t>
-      </w:r>
-      <w:bookmarkEnd w:id="29"/>
-    </w:p>
-    <w:p/>
-    <w:p>
-      <w:pPr>
-        <w:pStyle w:val="Heading3"/>
-      </w:pPr>
-      <w:bookmarkStart w:id="30" w:name="_Toc176793427"/>
-      <w:r>
-        <w:t>4.5.2 Activity Diagram</w:t>
-      </w:r>
-      <w:bookmarkEnd w:id="30"/>
-      <w:r>
-        <w:t xml:space="preserve"> </w:t>
-      </w:r>
-    </w:p>
-    <w:p/>
-    <w:p>
-      <w:pPr>
-        <w:pStyle w:val="Heading3"/>
-      </w:pPr>
-      <w:bookmarkStart w:id="31" w:name="_Toc176793428"/>
-      <w:r>
-        <w:t>4.5.3 Class Diagram</w:t>
-      </w:r>
-      <w:bookmarkEnd w:id="31"/>
-    </w:p>
-    <w:p/>
-    <w:p>
-      <w:pPr>
-        <w:pStyle w:val="Heading3"/>
-      </w:pPr>
-      <w:bookmarkStart w:id="32" w:name="_Toc176793429"/>
-      <w:r>
-        <w:t>4.5.4 Entity Relationship Diagram</w:t>
-      </w:r>
-      <w:bookmarkEnd w:id="32"/>
-    </w:p>
-    <w:p/>
-    <w:p/>
-    <w:p/>
-    <w:p/>
-    <w:p>
-      <w:pPr>
-        <w:pStyle w:val="Heading1"/>
-      </w:pPr>
-      <w:bookmarkStart w:id="33" w:name="_Toc176793430"/>
-      <w:r>
-        <w:lastRenderedPageBreak/>
-        <w:t>Chapter 5</w:t>
-      </w:r>
-      <w:bookmarkEnd w:id="33"/>
-    </w:p>
-    <w:p>
-      <w:pPr>
-        <w:pStyle w:val="Heading2"/>
-      </w:pPr>
-      <w:bookmarkStart w:id="34" w:name="_Toc176793431"/>
-      <w:r>
-        <w:t>5.1 Software Tools and Technologies</w:t>
-      </w:r>
-      <w:bookmarkEnd w:id="34"/>
-    </w:p>
-    <w:p>
-      <w:pPr>
-        <w:pStyle w:val="Heading3"/>
-      </w:pPr>
-      <w:bookmarkStart w:id="35" w:name="_Toc176793432"/>
-      <w:r>
-        <w:t>5.1.1 Justification about System Tools and Technology</w:t>
-      </w:r>
-      <w:bookmarkEnd w:id="35"/>
-    </w:p>
-    <w:p/>
-    <w:p/>
-    <w:p>
-      <w:pPr>
-        <w:pStyle w:val="Heading2"/>
-      </w:pPr>
-      <w:bookmarkStart w:id="36" w:name="_Toc176793433"/>
-      <w:r>
-        <w:t>5.2 Implementation Environment</w:t>
-      </w:r>
-      <w:bookmarkEnd w:id="36"/>
-      <w:r>
-        <w:t xml:space="preserve"> </w:t>
-      </w:r>
-    </w:p>
-    <w:p/>
-    <w:p>
-      <w:pPr>
-        <w:pStyle w:val="Heading2"/>
-      </w:pPr>
-      <w:bookmarkStart w:id="37" w:name="_Toc176793434"/>
-      <w:r>
-        <w:t>5.2.1 Hardware Environment</w:t>
-      </w:r>
-      <w:bookmarkEnd w:id="37"/>
-    </w:p>
-    <w:p/>
-    <w:p>
-      <w:pPr>
-        <w:pStyle w:val="Heading2"/>
-      </w:pPr>
-      <w:bookmarkStart w:id="38" w:name="_Toc176793435"/>
-      <w:r>
-        <w:t>5.2.2 Software Environment</w:t>
-      </w:r>
-      <w:bookmarkEnd w:id="38"/>
-      <w:r>
-        <w:t xml:space="preserve"> </w:t>
-      </w:r>
-    </w:p>
-    <w:p/>
-    <w:p>
-      <w:pPr>
-        <w:pStyle w:val="Heading2"/>
-      </w:pPr>
-      <w:bookmarkStart w:id="39" w:name="_Toc176793436"/>
-      <w:r>
-        <w:t>5.3 Module Structure</w:t>
-      </w:r>
-      <w:bookmarkEnd w:id="39"/>
-      <w:r>
-        <w:t xml:space="preserve"> </w:t>
-      </w:r>
-    </w:p>
-    <w:p/>
-    <w:p>
-      <w:pPr>
-        <w:pStyle w:val="Heading2"/>
-      </w:pPr>
-      <w:bookmarkStart w:id="40" w:name="_Toc176793437"/>
-      <w:r>
-        <w:t>5.4 Important Codes</w:t>
-      </w:r>
-      <w:bookmarkEnd w:id="40"/>
-    </w:p>
-    <w:p>
-      <w:pPr>
-        <w:rPr>
-          <w:rFonts w:eastAsiaTheme="majorEastAsia" w:cstheme="majorBidi"/>
-          <w:b/>
-          <w:szCs w:val="32"/>
-        </w:rPr>
-      </w:pPr>
-    </w:p>
-    <w:p/>
-    <w:p>
-      <w:pPr>
-        <w:pStyle w:val="Heading1"/>
-      </w:pPr>
-      <w:bookmarkStart w:id="41" w:name="_Toc176793438"/>
-      <w:r>
-        <w:t>Chapter 6</w:t>
-      </w:r>
-      <w:bookmarkEnd w:id="41"/>
-    </w:p>
-    <w:p>
-      <w:pPr>
-        <w:pStyle w:val="Heading2"/>
-      </w:pPr>
-      <w:bookmarkStart w:id="42" w:name="_Toc176793439"/>
-      <w:r>
-        <w:t>6.1 System Test Plan</w:t>
-      </w:r>
-      <w:bookmarkEnd w:id="42"/>
-    </w:p>
-    <w:p/>
-    <w:p>
-      <w:pPr>
-        <w:pStyle w:val="Heading2"/>
-      </w:pPr>
-      <w:bookmarkStart w:id="43" w:name="_Toc176793440"/>
-      <w:r>
-        <w:t>6.1.1 Test Plan for Wings Hotel</w:t>
-      </w:r>
-      <w:bookmarkEnd w:id="43"/>
-    </w:p>
-    <w:p/>
-    <w:p>
-      <w:pPr>
-        <w:pStyle w:val="Heading2"/>
-      </w:pPr>
-      <w:bookmarkStart w:id="44" w:name="_Toc176793441"/>
-      <w:r>
         <w:t>6.2 Test case and Test results</w:t>
       </w:r>
       <w:bookmarkEnd w:id="44"/>

</xml_diff>